<commit_message>
feat: documentation for audio interface added and link to block diagram added
</commit_message>
<xml_diff>
--- a/doc/report.docx
+++ b/doc/report.docx
@@ -86,7 +86,7 @@
           <w:rFonts w:hint="eastAsia"/>
           <w:noProof/>
         </w:rPr>
-        <w:t>11.04.2026</w:t>
+        <w:t>12.04.2026</w:t>
       </w:r>
       <w:r>
         <w:fldChar w:fldCharType="end"/>
@@ -480,6 +480,9 @@
       <w:pPr>
         <w:pStyle w:val="Textbody"/>
         <w:jc w:val="left"/>
+        <w:rPr>
+          <w:rFonts w:hint="eastAsia"/>
+        </w:rPr>
       </w:pPr>
       <w:r>
         <w:t>Adres repozytorium GITa:</w:t>
@@ -1260,7 +1263,6 @@
       <w:pPr>
         <w:pStyle w:val="Textbody"/>
         <w:rPr>
-          <w:rFonts w:hint="eastAsia"/>
           <w:color w:val="3333FF"/>
         </w:rPr>
       </w:pPr>
@@ -1270,6 +1272,46 @@
         </w:rPr>
         <w:t>Uwaga: Schemat blokowy to nie jest schemat z Vivado! Nie zawiera on sygnałów, tylko interfejsy. Interfejs oznacza tutaj grupę sygnałów. Schemat blokowy pokazuje moduły składowe, oraz łączące je interfejsy.</w:t>
       </w:r>
+    </w:p>
+    <w:p>
+      <w:pPr>
+        <w:pStyle w:val="Textbody"/>
+        <w:rPr>
+          <w:color w:val="3333FF"/>
+        </w:rPr>
+      </w:pPr>
+      <w:r>
+        <w:rPr>
+          <w:color w:val="3333FF"/>
+        </w:rPr>
+        <w:t xml:space="preserve">Schemat blokowy będzie rozwijany dalej </w:t>
+      </w:r>
+    </w:p>
+    <w:p>
+      <w:pPr>
+        <w:pStyle w:val="Textbody"/>
+        <w:rPr>
+          <w:color w:val="3333FF"/>
+        </w:rPr>
+      </w:pPr>
+      <w:hyperlink r:id="rId8" w:history="1">
+        <w:r>
+          <w:rPr>
+            <w:rStyle w:val="Hyperlink"/>
+            <w:rFonts w:hint="eastAsia"/>
+          </w:rPr>
+          <w:t>https://drive.google.com/file/d/17oKrBdAplq7NJbz_j9_vWXstqO-WTQQa/view?usp=sharing</w:t>
+        </w:r>
+      </w:hyperlink>
+    </w:p>
+    <w:p>
+      <w:pPr>
+        <w:pStyle w:val="Textbody"/>
+        <w:rPr>
+          <w:rFonts w:hint="eastAsia"/>
+          <w:color w:val="3333FF"/>
+        </w:rPr>
+      </w:pPr>
     </w:p>
     <w:p>
       <w:pPr>
@@ -1728,6 +1770,7 @@
               <w:jc w:val="center"/>
             </w:pPr>
             <w:r>
+              <w:lastRenderedPageBreak/>
               <w:t>vga_vs</w:t>
             </w:r>
           </w:p>
@@ -1810,7 +1853,6 @@
       </w:pPr>
       <w:bookmarkStart w:id="11" w:name="__RefHeading___Toc453_832888478"/>
       <w:r>
-        <w:lastRenderedPageBreak/>
         <w:t>Interfejsy</w:t>
       </w:r>
       <w:bookmarkEnd w:id="11"/>
@@ -2189,7 +2231,7 @@
                     <pic:cNvPicPr/>
                   </pic:nvPicPr>
                   <pic:blipFill>
-                    <a:blip r:embed="rId8">
+                    <a:blip r:embed="rId9">
                       <a:lum/>
                       <a:alphaModFix/>
                     </a:blip>
@@ -2550,6 +2592,7 @@
       </w:pPr>
       <w:bookmarkStart w:id="18" w:name="__RefHeading___Toc1319_2642343945"/>
       <w:r>
+        <w:lastRenderedPageBreak/>
         <w:t>Marginesy czasowe</w:t>
       </w:r>
       <w:bookmarkEnd w:id="18"/>
@@ -2574,7 +2617,6 @@
       </w:pPr>
       <w:bookmarkStart w:id="19" w:name="__RefHeading___Toc1249_1436539759"/>
       <w:r>
-        <w:lastRenderedPageBreak/>
         <w:t>Konfiguracja sprzęt</w:t>
       </w:r>
       <w:r>
@@ -2649,7 +2691,7 @@
       </w:r>
     </w:p>
     <w:sectPr>
-      <w:headerReference w:type="default" r:id="rId9"/>
+      <w:headerReference w:type="default" r:id="rId10"/>
       <w:pgSz w:w="11906" w:h="16838"/>
       <w:pgMar w:top="1134" w:right="1134" w:bottom="1134" w:left="1134" w:header="708" w:footer="708" w:gutter="0"/>
       <w:cols w:space="708"/>
@@ -2745,7 +2787,7 @@
         <w:rFonts w:hint="eastAsia"/>
         <w:noProof/>
       </w:rPr>
-      <w:t>11.04.2026</w:t>
+      <w:t>12.04.2026</w:t>
     </w:r>
     <w:r>
       <w:fldChar w:fldCharType="end"/>

</xml_diff>